<commit_message>
finalized implementation and design doc format final V
</commit_message>
<xml_diff>
--- a/docs/Lineage_Keyed_Verifier_Side_Revocation_Design_Document.docx
+++ b/docs/Lineage_Keyed_Verifier_Side_Revocation_Design_Document.docx
@@ -21,7 +21,9 @@
         <w:spacing w:lineRule="auto"/>
       </w:pPr>
       <w:r>
-        <w:rPr/>
+        <w:rPr>
+          <w:b/>
+        </w:rPr>
         <w:t xml:space="preserve">Lineage-Keyed Verifier-Side Revocation for Delegated Agent Systems</w:t>
       </w:r>
     </w:p>
@@ -42,9 +44,7 @@
         <w:spacing w:lineRule="auto"/>
       </w:pPr>
       <w:r>
-        <w:rPr>
-          <w:b/>
-        </w:rPr>
+        <w:rPr/>
         <w:t xml:space="preserve">Rayyan Ahmed</w:t>
       </w:r>
     </w:p>
@@ -53,21 +53,8 @@
         <w:spacing w:lineRule="auto"/>
       </w:pPr>
       <w:r>
-        <w:rPr>
-          <w:b/>
-        </w:rPr>
-        <w:t xml:space="preserve">University of Debrecen</w:t>
-      </w:r>
-    </w:p>
-    <w:p>
-      <w:pPr>
-        <w:spacing w:lineRule="auto"/>
-      </w:pPr>
-      <w:r>
-        <w:rPr>
-          <w:b/>
-        </w:rPr>
-        <w:t xml:space="preserve">Computer Science</w:t>
+        <w:rPr/>
+        <w:t xml:space="preserve">University of Debrecen, Computer Science</w:t>
       </w:r>
     </w:p>
     <w:p>

</xml_diff>